<commit_message>
Day 10 file Added
</commit_message>
<xml_diff>
--- a/Task_Docx/10092912_Day12.docx
+++ b/Task_Docx/10092912_Day12.docx
@@ -4700,10 +4700,10 @@
           <w:b/>
           <w:bCs/>
         </w:rPr>
-        <w:t>Third Normal Form (3NF)</w:t>
-      </w:r>
-      <w:r>
-        <w:t xml:space="preserve"> if:</w:t>
+        <w:t>T</w:t>
+      </w:r>
+      <w:r>
+        <w:t>hird Normal Form (3NF) if:</w:t>
       </w:r>
     </w:p>
     <w:p>
@@ -4830,6 +4830,2452 @@
         </w:drawing>
       </w:r>
     </w:p>
+    <w:p>
+      <w:pPr>
+        <w:rPr>
+          <w:b/>
+          <w:bCs/>
+        </w:rPr>
+      </w:pPr>
+    </w:p>
+    <w:p>
+      <w:pPr>
+        <w:rPr>
+          <w:b/>
+          <w:bCs/>
+        </w:rPr>
+      </w:pPr>
+      <w:r>
+        <w:rPr>
+          <w:b/>
+          <w:bCs/>
+          <w:highlight w:val="yellow"/>
+        </w:rPr>
+        <w:t>Task 17:</w:t>
+      </w:r>
+    </w:p>
+    <w:p>
+      <w:pPr>
+        <w:rPr>
+          <w:b/>
+          <w:bCs/>
+        </w:rPr>
+      </w:pPr>
+      <w:r>
+        <w:rPr>
+          <w:b/>
+          <w:bCs/>
+        </w:rPr>
+        <w:t>What do you understand by joins? Explain all joins with examples</w:t>
+      </w:r>
+    </w:p>
+    <w:p>
+      <w:r>
+        <w:t xml:space="preserve">A </w:t>
+      </w:r>
+      <w:r>
+        <w:rPr>
+          <w:b/>
+          <w:bCs/>
+        </w:rPr>
+        <w:t>JOIN</w:t>
+      </w:r>
+      <w:r>
+        <w:t xml:space="preserve"> is an SQL operation used to combine rows from two or more tables based on a related column (usually a </w:t>
+      </w:r>
+      <w:r>
+        <w:rPr>
+          <w:b/>
+          <w:bCs/>
+        </w:rPr>
+        <w:t>Primary Key</w:t>
+      </w:r>
+      <w:r>
+        <w:t xml:space="preserve"> and a </w:t>
+      </w:r>
+      <w:r>
+        <w:rPr>
+          <w:b/>
+          <w:bCs/>
+        </w:rPr>
+        <w:t>Foreign Key</w:t>
+      </w:r>
+      <w:r>
+        <w:t>).</w:t>
+      </w:r>
+    </w:p>
+    <w:p>
+      <w:r>
+        <w:t>Joins are used to retrieve related data stored in different tables.</w:t>
+      </w:r>
+    </w:p>
+    <w:p>
+      <w:r>
+        <w:t>For example:</w:t>
+      </w:r>
+    </w:p>
+    <w:p>
+      <w:pPr>
+        <w:numPr>
+          <w:ilvl w:val="0"/>
+          <w:numId w:val="23"/>
+        </w:numPr>
+      </w:pPr>
+      <w:r>
+        <w:rPr>
+          <w:b/>
+          <w:bCs/>
+        </w:rPr>
+        <w:t>Student Table</w:t>
+      </w:r>
+      <w:r>
+        <w:t xml:space="preserve"> contains student details. </w:t>
+      </w:r>
+    </w:p>
+    <w:p>
+      <w:pPr>
+        <w:numPr>
+          <w:ilvl w:val="0"/>
+          <w:numId w:val="23"/>
+        </w:numPr>
+      </w:pPr>
+      <w:r>
+        <w:rPr>
+          <w:b/>
+          <w:bCs/>
+        </w:rPr>
+        <w:t>Department Table</w:t>
+      </w:r>
+      <w:r>
+        <w:t xml:space="preserve"> contains department details. </w:t>
+      </w:r>
+    </w:p>
+    <w:p>
+      <w:r>
+        <w:t>Using a JOIN, we can display the student along with their department.</w:t>
+      </w:r>
+    </w:p>
+    <w:p>
+      <w:pPr>
+        <w:rPr>
+          <w:b/>
+          <w:bCs/>
+        </w:rPr>
+      </w:pPr>
+      <w:r>
+        <w:rPr>
+          <w:b/>
+          <w:bCs/>
+        </w:rPr>
+        <w:t>Example Tables</w:t>
+      </w:r>
+    </w:p>
+    <w:p>
+      <w:pPr>
+        <w:rPr>
+          <w:b/>
+          <w:bCs/>
+        </w:rPr>
+      </w:pPr>
+      <w:r>
+        <w:rPr>
+          <w:b/>
+          <w:bCs/>
+        </w:rPr>
+        <w:t>Student Table</w:t>
+      </w:r>
+    </w:p>
+    <w:tbl>
+      <w:tblPr>
+        <w:tblW w:w="0" w:type="auto"/>
+        <w:tblCellSpacing w:w="15" w:type="dxa"/>
+        <w:tblBorders>
+          <w:top w:val="single" w:sz="4" w:space="0" w:color="auto"/>
+          <w:left w:val="single" w:sz="4" w:space="0" w:color="auto"/>
+          <w:bottom w:val="single" w:sz="4" w:space="0" w:color="auto"/>
+          <w:right w:val="single" w:sz="4" w:space="0" w:color="auto"/>
+          <w:insideH w:val="single" w:sz="4" w:space="0" w:color="auto"/>
+          <w:insideV w:val="single" w:sz="4" w:space="0" w:color="auto"/>
+        </w:tblBorders>
+        <w:tblCellMar>
+          <w:top w:w="15" w:type="dxa"/>
+          <w:left w:w="15" w:type="dxa"/>
+          <w:bottom w:w="15" w:type="dxa"/>
+          <w:right w:w="15" w:type="dxa"/>
+        </w:tblCellMar>
+        <w:tblLook w:val="04A0" w:firstRow="1" w:lastRow="0" w:firstColumn="1" w:lastColumn="0" w:noHBand="0" w:noVBand="1"/>
+      </w:tblPr>
+      <w:tblGrid>
+        <w:gridCol w:w="1203"/>
+        <w:gridCol w:w="833"/>
+        <w:gridCol w:w="865"/>
+      </w:tblGrid>
+      <w:tr>
+        <w:trPr>
+          <w:tblHeader/>
+          <w:tblCellSpacing w:w="15" w:type="dxa"/>
+        </w:trPr>
+        <w:tc>
+          <w:tcPr>
+            <w:tcW w:w="0" w:type="auto"/>
+            <w:vAlign w:val="center"/>
+            <w:hideMark/>
+          </w:tcPr>
+          <w:p>
+            <w:pPr>
+              <w:rPr>
+                <w:b/>
+                <w:bCs/>
+              </w:rPr>
+            </w:pPr>
+            <w:proofErr w:type="spellStart"/>
+            <w:r>
+              <w:rPr>
+                <w:b/>
+                <w:bCs/>
+              </w:rPr>
+              <w:t>StudentID</w:t>
+            </w:r>
+            <w:proofErr w:type="spellEnd"/>
+          </w:p>
+        </w:tc>
+        <w:tc>
+          <w:tcPr>
+            <w:tcW w:w="0" w:type="auto"/>
+            <w:vAlign w:val="center"/>
+            <w:hideMark/>
+          </w:tcPr>
+          <w:p>
+            <w:pPr>
+              <w:rPr>
+                <w:b/>
+                <w:bCs/>
+              </w:rPr>
+            </w:pPr>
+            <w:r>
+              <w:rPr>
+                <w:b/>
+                <w:bCs/>
+              </w:rPr>
+              <w:t>Name</w:t>
+            </w:r>
+          </w:p>
+        </w:tc>
+        <w:tc>
+          <w:tcPr>
+            <w:tcW w:w="0" w:type="auto"/>
+            <w:vAlign w:val="center"/>
+            <w:hideMark/>
+          </w:tcPr>
+          <w:p>
+            <w:pPr>
+              <w:rPr>
+                <w:b/>
+                <w:bCs/>
+              </w:rPr>
+            </w:pPr>
+            <w:proofErr w:type="spellStart"/>
+            <w:r>
+              <w:rPr>
+                <w:b/>
+                <w:bCs/>
+              </w:rPr>
+              <w:t>DeptID</w:t>
+            </w:r>
+            <w:proofErr w:type="spellEnd"/>
+          </w:p>
+        </w:tc>
+      </w:tr>
+      <w:tr>
+        <w:trPr>
+          <w:tblCellSpacing w:w="15" w:type="dxa"/>
+        </w:trPr>
+        <w:tc>
+          <w:tcPr>
+            <w:tcW w:w="0" w:type="auto"/>
+            <w:vAlign w:val="center"/>
+            <w:hideMark/>
+          </w:tcPr>
+          <w:p>
+            <w:r>
+              <w:t>101</w:t>
+            </w:r>
+          </w:p>
+        </w:tc>
+        <w:tc>
+          <w:tcPr>
+            <w:tcW w:w="0" w:type="auto"/>
+            <w:vAlign w:val="center"/>
+            <w:hideMark/>
+          </w:tcPr>
+          <w:p>
+            <w:r>
+              <w:t>Alice</w:t>
+            </w:r>
+          </w:p>
+        </w:tc>
+        <w:tc>
+          <w:tcPr>
+            <w:tcW w:w="0" w:type="auto"/>
+            <w:vAlign w:val="center"/>
+            <w:hideMark/>
+          </w:tcPr>
+          <w:p>
+            <w:r>
+              <w:t>10</w:t>
+            </w:r>
+          </w:p>
+        </w:tc>
+      </w:tr>
+      <w:tr>
+        <w:trPr>
+          <w:tblCellSpacing w:w="15" w:type="dxa"/>
+        </w:trPr>
+        <w:tc>
+          <w:tcPr>
+            <w:tcW w:w="0" w:type="auto"/>
+            <w:vAlign w:val="center"/>
+            <w:hideMark/>
+          </w:tcPr>
+          <w:p>
+            <w:r>
+              <w:t>102</w:t>
+            </w:r>
+          </w:p>
+        </w:tc>
+        <w:tc>
+          <w:tcPr>
+            <w:tcW w:w="0" w:type="auto"/>
+            <w:vAlign w:val="center"/>
+            <w:hideMark/>
+          </w:tcPr>
+          <w:p>
+            <w:r>
+              <w:t>Bob</w:t>
+            </w:r>
+          </w:p>
+        </w:tc>
+        <w:tc>
+          <w:tcPr>
+            <w:tcW w:w="0" w:type="auto"/>
+            <w:vAlign w:val="center"/>
+            <w:hideMark/>
+          </w:tcPr>
+          <w:p>
+            <w:r>
+              <w:t>20</w:t>
+            </w:r>
+          </w:p>
+        </w:tc>
+      </w:tr>
+      <w:tr>
+        <w:trPr>
+          <w:tblCellSpacing w:w="15" w:type="dxa"/>
+        </w:trPr>
+        <w:tc>
+          <w:tcPr>
+            <w:tcW w:w="0" w:type="auto"/>
+            <w:vAlign w:val="center"/>
+            <w:hideMark/>
+          </w:tcPr>
+          <w:p>
+            <w:r>
+              <w:t>103</w:t>
+            </w:r>
+          </w:p>
+        </w:tc>
+        <w:tc>
+          <w:tcPr>
+            <w:tcW w:w="0" w:type="auto"/>
+            <w:vAlign w:val="center"/>
+            <w:hideMark/>
+          </w:tcPr>
+          <w:p>
+            <w:r>
+              <w:t>Charlie</w:t>
+            </w:r>
+          </w:p>
+        </w:tc>
+        <w:tc>
+          <w:tcPr>
+            <w:tcW w:w="0" w:type="auto"/>
+            <w:vAlign w:val="center"/>
+            <w:hideMark/>
+          </w:tcPr>
+          <w:p>
+            <w:r>
+              <w:t>30</w:t>
+            </w:r>
+          </w:p>
+        </w:tc>
+      </w:tr>
+      <w:tr>
+        <w:trPr>
+          <w:tblCellSpacing w:w="15" w:type="dxa"/>
+        </w:trPr>
+        <w:tc>
+          <w:tcPr>
+            <w:tcW w:w="0" w:type="auto"/>
+            <w:vAlign w:val="center"/>
+            <w:hideMark/>
+          </w:tcPr>
+          <w:p>
+            <w:r>
+              <w:t>104</w:t>
+            </w:r>
+          </w:p>
+        </w:tc>
+        <w:tc>
+          <w:tcPr>
+            <w:tcW w:w="0" w:type="auto"/>
+            <w:vAlign w:val="center"/>
+            <w:hideMark/>
+          </w:tcPr>
+          <w:p>
+            <w:r>
+              <w:t>David</w:t>
+            </w:r>
+          </w:p>
+        </w:tc>
+        <w:tc>
+          <w:tcPr>
+            <w:tcW w:w="0" w:type="auto"/>
+            <w:vAlign w:val="center"/>
+            <w:hideMark/>
+          </w:tcPr>
+          <w:p>
+            <w:r>
+              <w:t>NULL</w:t>
+            </w:r>
+          </w:p>
+        </w:tc>
+      </w:tr>
+    </w:tbl>
+    <w:p>
+      <w:pPr>
+        <w:rPr>
+          <w:b/>
+          <w:bCs/>
+        </w:rPr>
+      </w:pPr>
+      <w:r>
+        <w:rPr>
+          <w:b/>
+          <w:bCs/>
+        </w:rPr>
+        <w:t>Department Table</w:t>
+      </w:r>
+    </w:p>
+    <w:tbl>
+      <w:tblPr>
+        <w:tblW w:w="0" w:type="auto"/>
+        <w:tblCellSpacing w:w="15" w:type="dxa"/>
+        <w:tblBorders>
+          <w:top w:val="single" w:sz="4" w:space="0" w:color="auto"/>
+          <w:left w:val="single" w:sz="4" w:space="0" w:color="auto"/>
+          <w:bottom w:val="single" w:sz="4" w:space="0" w:color="auto"/>
+          <w:right w:val="single" w:sz="4" w:space="0" w:color="auto"/>
+          <w:insideH w:val="single" w:sz="4" w:space="0" w:color="auto"/>
+          <w:insideV w:val="single" w:sz="4" w:space="0" w:color="auto"/>
+        </w:tblBorders>
+        <w:tblCellMar>
+          <w:top w:w="15" w:type="dxa"/>
+          <w:left w:w="15" w:type="dxa"/>
+          <w:bottom w:w="15" w:type="dxa"/>
+          <w:right w:w="15" w:type="dxa"/>
+        </w:tblCellMar>
+        <w:tblLook w:val="04A0" w:firstRow="1" w:lastRow="0" w:firstColumn="1" w:lastColumn="0" w:noHBand="0" w:noVBand="1"/>
+      </w:tblPr>
+      <w:tblGrid>
+        <w:gridCol w:w="865"/>
+        <w:gridCol w:w="1416"/>
+      </w:tblGrid>
+      <w:tr>
+        <w:trPr>
+          <w:tblHeader/>
+          <w:tblCellSpacing w:w="15" w:type="dxa"/>
+        </w:trPr>
+        <w:tc>
+          <w:tcPr>
+            <w:tcW w:w="0" w:type="auto"/>
+            <w:vAlign w:val="center"/>
+            <w:hideMark/>
+          </w:tcPr>
+          <w:p>
+            <w:pPr>
+              <w:rPr>
+                <w:b/>
+                <w:bCs/>
+              </w:rPr>
+            </w:pPr>
+            <w:proofErr w:type="spellStart"/>
+            <w:r>
+              <w:rPr>
+                <w:b/>
+                <w:bCs/>
+              </w:rPr>
+              <w:t>DeptID</w:t>
+            </w:r>
+            <w:proofErr w:type="spellEnd"/>
+          </w:p>
+        </w:tc>
+        <w:tc>
+          <w:tcPr>
+            <w:tcW w:w="0" w:type="auto"/>
+            <w:vAlign w:val="center"/>
+            <w:hideMark/>
+          </w:tcPr>
+          <w:p>
+            <w:pPr>
+              <w:rPr>
+                <w:b/>
+                <w:bCs/>
+              </w:rPr>
+            </w:pPr>
+            <w:r>
+              <w:rPr>
+                <w:b/>
+                <w:bCs/>
+              </w:rPr>
+              <w:t>Department</w:t>
+            </w:r>
+          </w:p>
+        </w:tc>
+      </w:tr>
+      <w:tr>
+        <w:trPr>
+          <w:tblCellSpacing w:w="15" w:type="dxa"/>
+        </w:trPr>
+        <w:tc>
+          <w:tcPr>
+            <w:tcW w:w="0" w:type="auto"/>
+            <w:vAlign w:val="center"/>
+            <w:hideMark/>
+          </w:tcPr>
+          <w:p>
+            <w:r>
+              <w:t>10</w:t>
+            </w:r>
+          </w:p>
+        </w:tc>
+        <w:tc>
+          <w:tcPr>
+            <w:tcW w:w="0" w:type="auto"/>
+            <w:vAlign w:val="center"/>
+            <w:hideMark/>
+          </w:tcPr>
+          <w:p>
+            <w:r>
+              <w:t>CSE</w:t>
+            </w:r>
+          </w:p>
+        </w:tc>
+      </w:tr>
+      <w:tr>
+        <w:trPr>
+          <w:tblCellSpacing w:w="15" w:type="dxa"/>
+        </w:trPr>
+        <w:tc>
+          <w:tcPr>
+            <w:tcW w:w="0" w:type="auto"/>
+            <w:vAlign w:val="center"/>
+            <w:hideMark/>
+          </w:tcPr>
+          <w:p>
+            <w:r>
+              <w:t>20</w:t>
+            </w:r>
+          </w:p>
+        </w:tc>
+        <w:tc>
+          <w:tcPr>
+            <w:tcW w:w="0" w:type="auto"/>
+            <w:vAlign w:val="center"/>
+            <w:hideMark/>
+          </w:tcPr>
+          <w:p>
+            <w:r>
+              <w:t>ECE</w:t>
+            </w:r>
+          </w:p>
+        </w:tc>
+      </w:tr>
+      <w:tr>
+        <w:trPr>
+          <w:tblCellSpacing w:w="15" w:type="dxa"/>
+        </w:trPr>
+        <w:tc>
+          <w:tcPr>
+            <w:tcW w:w="0" w:type="auto"/>
+            <w:vAlign w:val="center"/>
+            <w:hideMark/>
+          </w:tcPr>
+          <w:p>
+            <w:r>
+              <w:t>40</w:t>
+            </w:r>
+          </w:p>
+        </w:tc>
+        <w:tc>
+          <w:tcPr>
+            <w:tcW w:w="0" w:type="auto"/>
+            <w:vAlign w:val="center"/>
+            <w:hideMark/>
+          </w:tcPr>
+          <w:p>
+            <w:r>
+              <w:t>Civil</w:t>
+            </w:r>
+          </w:p>
+        </w:tc>
+      </w:tr>
+    </w:tbl>
+    <w:p>
+      <w:pPr>
+        <w:rPr>
+          <w:b/>
+          <w:bCs/>
+        </w:rPr>
+      </w:pPr>
+      <w:r>
+        <w:br/>
+      </w:r>
+      <w:r>
+        <w:rPr>
+          <w:b/>
+          <w:bCs/>
+        </w:rPr>
+        <w:t>1. INNER JOIN</w:t>
+      </w:r>
+    </w:p>
+    <w:p>
+      <w:r>
+        <w:t xml:space="preserve">An </w:t>
+      </w:r>
+      <w:r>
+        <w:rPr>
+          <w:b/>
+          <w:bCs/>
+        </w:rPr>
+        <w:t>INNER JOIN</w:t>
+      </w:r>
+      <w:r>
+        <w:t xml:space="preserve"> returns only the rows that have matching values in both tables.</w:t>
+      </w:r>
+    </w:p>
+    <w:p>
+      <w:pPr>
+        <w:rPr>
+          <w:b/>
+          <w:bCs/>
+        </w:rPr>
+      </w:pPr>
+      <w:r>
+        <w:rPr>
+          <w:b/>
+          <w:bCs/>
+        </w:rPr>
+        <w:t>Output</w:t>
+      </w:r>
+    </w:p>
+    <w:tbl>
+      <w:tblPr>
+        <w:tblW w:w="0" w:type="auto"/>
+        <w:tblCellSpacing w:w="15" w:type="dxa"/>
+        <w:tblBorders>
+          <w:top w:val="single" w:sz="4" w:space="0" w:color="auto"/>
+          <w:left w:val="single" w:sz="4" w:space="0" w:color="auto"/>
+          <w:bottom w:val="single" w:sz="4" w:space="0" w:color="auto"/>
+          <w:right w:val="single" w:sz="4" w:space="0" w:color="auto"/>
+          <w:insideH w:val="single" w:sz="4" w:space="0" w:color="auto"/>
+          <w:insideV w:val="single" w:sz="4" w:space="0" w:color="auto"/>
+        </w:tblBorders>
+        <w:tblCellMar>
+          <w:top w:w="15" w:type="dxa"/>
+          <w:left w:w="15" w:type="dxa"/>
+          <w:bottom w:w="15" w:type="dxa"/>
+          <w:right w:w="15" w:type="dxa"/>
+        </w:tblCellMar>
+        <w:tblLook w:val="04A0" w:firstRow="1" w:lastRow="0" w:firstColumn="1" w:lastColumn="0" w:noHBand="0" w:noVBand="1"/>
+      </w:tblPr>
+      <w:tblGrid>
+        <w:gridCol w:w="1203"/>
+        <w:gridCol w:w="733"/>
+        <w:gridCol w:w="1416"/>
+      </w:tblGrid>
+      <w:tr>
+        <w:trPr>
+          <w:tblHeader/>
+          <w:tblCellSpacing w:w="15" w:type="dxa"/>
+        </w:trPr>
+        <w:tc>
+          <w:tcPr>
+            <w:tcW w:w="0" w:type="auto"/>
+            <w:vAlign w:val="center"/>
+            <w:hideMark/>
+          </w:tcPr>
+          <w:p>
+            <w:pPr>
+              <w:rPr>
+                <w:b/>
+                <w:bCs/>
+              </w:rPr>
+            </w:pPr>
+            <w:proofErr w:type="spellStart"/>
+            <w:r>
+              <w:rPr>
+                <w:b/>
+                <w:bCs/>
+              </w:rPr>
+              <w:lastRenderedPageBreak/>
+              <w:t>StudentID</w:t>
+            </w:r>
+            <w:proofErr w:type="spellEnd"/>
+          </w:p>
+        </w:tc>
+        <w:tc>
+          <w:tcPr>
+            <w:tcW w:w="0" w:type="auto"/>
+            <w:vAlign w:val="center"/>
+            <w:hideMark/>
+          </w:tcPr>
+          <w:p>
+            <w:pPr>
+              <w:rPr>
+                <w:b/>
+                <w:bCs/>
+              </w:rPr>
+            </w:pPr>
+            <w:r>
+              <w:rPr>
+                <w:b/>
+                <w:bCs/>
+              </w:rPr>
+              <w:t>Name</w:t>
+            </w:r>
+          </w:p>
+        </w:tc>
+        <w:tc>
+          <w:tcPr>
+            <w:tcW w:w="0" w:type="auto"/>
+            <w:vAlign w:val="center"/>
+            <w:hideMark/>
+          </w:tcPr>
+          <w:p>
+            <w:pPr>
+              <w:rPr>
+                <w:b/>
+                <w:bCs/>
+              </w:rPr>
+            </w:pPr>
+            <w:r>
+              <w:rPr>
+                <w:b/>
+                <w:bCs/>
+              </w:rPr>
+              <w:t>Department</w:t>
+            </w:r>
+          </w:p>
+        </w:tc>
+      </w:tr>
+      <w:tr>
+        <w:trPr>
+          <w:tblCellSpacing w:w="15" w:type="dxa"/>
+        </w:trPr>
+        <w:tc>
+          <w:tcPr>
+            <w:tcW w:w="0" w:type="auto"/>
+            <w:vAlign w:val="center"/>
+            <w:hideMark/>
+          </w:tcPr>
+          <w:p>
+            <w:r>
+              <w:t>101</w:t>
+            </w:r>
+          </w:p>
+        </w:tc>
+        <w:tc>
+          <w:tcPr>
+            <w:tcW w:w="0" w:type="auto"/>
+            <w:vAlign w:val="center"/>
+            <w:hideMark/>
+          </w:tcPr>
+          <w:p>
+            <w:r>
+              <w:t>Alice</w:t>
+            </w:r>
+          </w:p>
+        </w:tc>
+        <w:tc>
+          <w:tcPr>
+            <w:tcW w:w="0" w:type="auto"/>
+            <w:vAlign w:val="center"/>
+            <w:hideMark/>
+          </w:tcPr>
+          <w:p>
+            <w:r>
+              <w:t>CSE</w:t>
+            </w:r>
+          </w:p>
+        </w:tc>
+      </w:tr>
+      <w:tr>
+        <w:trPr>
+          <w:tblCellSpacing w:w="15" w:type="dxa"/>
+        </w:trPr>
+        <w:tc>
+          <w:tcPr>
+            <w:tcW w:w="0" w:type="auto"/>
+            <w:vAlign w:val="center"/>
+            <w:hideMark/>
+          </w:tcPr>
+          <w:p>
+            <w:r>
+              <w:t>102</w:t>
+            </w:r>
+          </w:p>
+        </w:tc>
+        <w:tc>
+          <w:tcPr>
+            <w:tcW w:w="0" w:type="auto"/>
+            <w:vAlign w:val="center"/>
+            <w:hideMark/>
+          </w:tcPr>
+          <w:p>
+            <w:r>
+              <w:t>Bob</w:t>
+            </w:r>
+          </w:p>
+        </w:tc>
+        <w:tc>
+          <w:tcPr>
+            <w:tcW w:w="0" w:type="auto"/>
+            <w:vAlign w:val="center"/>
+            <w:hideMark/>
+          </w:tcPr>
+          <w:p>
+            <w:r>
+              <w:t>ECE</w:t>
+            </w:r>
+          </w:p>
+        </w:tc>
+      </w:tr>
+    </w:tbl>
+    <w:p/>
+    <w:p>
+      <w:pPr>
+        <w:rPr>
+          <w:b/>
+          <w:bCs/>
+        </w:rPr>
+      </w:pPr>
+      <w:r>
+        <w:rPr>
+          <w:b/>
+          <w:bCs/>
+        </w:rPr>
+        <w:t>2. LEFT JOIN (LEFT OUTER JOIN)</w:t>
+      </w:r>
+    </w:p>
+    <w:p>
+      <w:r>
+        <w:t xml:space="preserve">A </w:t>
+      </w:r>
+      <w:r>
+        <w:rPr>
+          <w:b/>
+          <w:bCs/>
+        </w:rPr>
+        <w:t>LEFT JOIN</w:t>
+      </w:r>
+      <w:r>
+        <w:t xml:space="preserve"> returns all rows from the left table and matching rows from the right table. If there is no match, NULL values are returned.</w:t>
+      </w:r>
+    </w:p>
+    <w:p>
+      <w:pPr>
+        <w:rPr>
+          <w:b/>
+          <w:bCs/>
+        </w:rPr>
+      </w:pPr>
+      <w:r>
+        <w:rPr>
+          <w:b/>
+          <w:bCs/>
+        </w:rPr>
+        <w:t>SQL</w:t>
+      </w:r>
+    </w:p>
+    <w:tbl>
+      <w:tblPr>
+        <w:tblW w:w="0" w:type="auto"/>
+        <w:tblCellSpacing w:w="15" w:type="dxa"/>
+        <w:tblBorders>
+          <w:top w:val="single" w:sz="4" w:space="0" w:color="auto"/>
+          <w:left w:val="single" w:sz="4" w:space="0" w:color="auto"/>
+          <w:bottom w:val="single" w:sz="4" w:space="0" w:color="auto"/>
+          <w:right w:val="single" w:sz="4" w:space="0" w:color="auto"/>
+          <w:insideH w:val="single" w:sz="4" w:space="0" w:color="auto"/>
+          <w:insideV w:val="single" w:sz="4" w:space="0" w:color="auto"/>
+        </w:tblBorders>
+        <w:tblCellMar>
+          <w:top w:w="15" w:type="dxa"/>
+          <w:left w:w="15" w:type="dxa"/>
+          <w:bottom w:w="15" w:type="dxa"/>
+          <w:right w:w="15" w:type="dxa"/>
+        </w:tblCellMar>
+        <w:tblLook w:val="04A0" w:firstRow="1" w:lastRow="0" w:firstColumn="1" w:lastColumn="0" w:noHBand="0" w:noVBand="1"/>
+      </w:tblPr>
+      <w:tblGrid>
+        <w:gridCol w:w="1203"/>
+        <w:gridCol w:w="833"/>
+        <w:gridCol w:w="1416"/>
+      </w:tblGrid>
+      <w:tr>
+        <w:trPr>
+          <w:tblHeader/>
+          <w:tblCellSpacing w:w="15" w:type="dxa"/>
+        </w:trPr>
+        <w:tc>
+          <w:tcPr>
+            <w:tcW w:w="0" w:type="auto"/>
+            <w:vAlign w:val="center"/>
+            <w:hideMark/>
+          </w:tcPr>
+          <w:p>
+            <w:pPr>
+              <w:rPr>
+                <w:b/>
+                <w:bCs/>
+              </w:rPr>
+            </w:pPr>
+            <w:proofErr w:type="spellStart"/>
+            <w:r>
+              <w:rPr>
+                <w:b/>
+                <w:bCs/>
+              </w:rPr>
+              <w:t>StudentID</w:t>
+            </w:r>
+            <w:proofErr w:type="spellEnd"/>
+          </w:p>
+        </w:tc>
+        <w:tc>
+          <w:tcPr>
+            <w:tcW w:w="0" w:type="auto"/>
+            <w:vAlign w:val="center"/>
+            <w:hideMark/>
+          </w:tcPr>
+          <w:p>
+            <w:pPr>
+              <w:rPr>
+                <w:b/>
+                <w:bCs/>
+              </w:rPr>
+            </w:pPr>
+            <w:r>
+              <w:rPr>
+                <w:b/>
+                <w:bCs/>
+              </w:rPr>
+              <w:t>Name</w:t>
+            </w:r>
+          </w:p>
+        </w:tc>
+        <w:tc>
+          <w:tcPr>
+            <w:tcW w:w="0" w:type="auto"/>
+            <w:vAlign w:val="center"/>
+            <w:hideMark/>
+          </w:tcPr>
+          <w:p>
+            <w:pPr>
+              <w:rPr>
+                <w:b/>
+                <w:bCs/>
+              </w:rPr>
+            </w:pPr>
+            <w:r>
+              <w:rPr>
+                <w:b/>
+                <w:bCs/>
+              </w:rPr>
+              <w:t>Department</w:t>
+            </w:r>
+          </w:p>
+        </w:tc>
+      </w:tr>
+      <w:tr>
+        <w:trPr>
+          <w:tblCellSpacing w:w="15" w:type="dxa"/>
+        </w:trPr>
+        <w:tc>
+          <w:tcPr>
+            <w:tcW w:w="0" w:type="auto"/>
+            <w:vAlign w:val="center"/>
+            <w:hideMark/>
+          </w:tcPr>
+          <w:p>
+            <w:r>
+              <w:t>101</w:t>
+            </w:r>
+          </w:p>
+        </w:tc>
+        <w:tc>
+          <w:tcPr>
+            <w:tcW w:w="0" w:type="auto"/>
+            <w:vAlign w:val="center"/>
+            <w:hideMark/>
+          </w:tcPr>
+          <w:p>
+            <w:r>
+              <w:t>Alice</w:t>
+            </w:r>
+          </w:p>
+        </w:tc>
+        <w:tc>
+          <w:tcPr>
+            <w:tcW w:w="0" w:type="auto"/>
+            <w:vAlign w:val="center"/>
+            <w:hideMark/>
+          </w:tcPr>
+          <w:p>
+            <w:r>
+              <w:t>CSE</w:t>
+            </w:r>
+          </w:p>
+        </w:tc>
+      </w:tr>
+      <w:tr>
+        <w:trPr>
+          <w:tblCellSpacing w:w="15" w:type="dxa"/>
+        </w:trPr>
+        <w:tc>
+          <w:tcPr>
+            <w:tcW w:w="0" w:type="auto"/>
+            <w:vAlign w:val="center"/>
+            <w:hideMark/>
+          </w:tcPr>
+          <w:p>
+            <w:r>
+              <w:t>102</w:t>
+            </w:r>
+          </w:p>
+        </w:tc>
+        <w:tc>
+          <w:tcPr>
+            <w:tcW w:w="0" w:type="auto"/>
+            <w:vAlign w:val="center"/>
+            <w:hideMark/>
+          </w:tcPr>
+          <w:p>
+            <w:r>
+              <w:t>Bob</w:t>
+            </w:r>
+          </w:p>
+        </w:tc>
+        <w:tc>
+          <w:tcPr>
+            <w:tcW w:w="0" w:type="auto"/>
+            <w:vAlign w:val="center"/>
+            <w:hideMark/>
+          </w:tcPr>
+          <w:p>
+            <w:r>
+              <w:t>ECE</w:t>
+            </w:r>
+          </w:p>
+        </w:tc>
+      </w:tr>
+      <w:tr>
+        <w:trPr>
+          <w:tblCellSpacing w:w="15" w:type="dxa"/>
+        </w:trPr>
+        <w:tc>
+          <w:tcPr>
+            <w:tcW w:w="0" w:type="auto"/>
+            <w:vAlign w:val="center"/>
+            <w:hideMark/>
+          </w:tcPr>
+          <w:p>
+            <w:r>
+              <w:t>103</w:t>
+            </w:r>
+          </w:p>
+        </w:tc>
+        <w:tc>
+          <w:tcPr>
+            <w:tcW w:w="0" w:type="auto"/>
+            <w:vAlign w:val="center"/>
+            <w:hideMark/>
+          </w:tcPr>
+          <w:p>
+            <w:r>
+              <w:t>Charlie</w:t>
+            </w:r>
+          </w:p>
+        </w:tc>
+        <w:tc>
+          <w:tcPr>
+            <w:tcW w:w="0" w:type="auto"/>
+            <w:vAlign w:val="center"/>
+            <w:hideMark/>
+          </w:tcPr>
+          <w:p>
+            <w:r>
+              <w:t>NULL</w:t>
+            </w:r>
+          </w:p>
+        </w:tc>
+      </w:tr>
+      <w:tr>
+        <w:trPr>
+          <w:tblCellSpacing w:w="15" w:type="dxa"/>
+        </w:trPr>
+        <w:tc>
+          <w:tcPr>
+            <w:tcW w:w="0" w:type="auto"/>
+            <w:vAlign w:val="center"/>
+            <w:hideMark/>
+          </w:tcPr>
+          <w:p>
+            <w:r>
+              <w:t>104</w:t>
+            </w:r>
+          </w:p>
+        </w:tc>
+        <w:tc>
+          <w:tcPr>
+            <w:tcW w:w="0" w:type="auto"/>
+            <w:vAlign w:val="center"/>
+            <w:hideMark/>
+          </w:tcPr>
+          <w:p>
+            <w:r>
+              <w:t>David</w:t>
+            </w:r>
+          </w:p>
+        </w:tc>
+        <w:tc>
+          <w:tcPr>
+            <w:tcW w:w="0" w:type="auto"/>
+            <w:vAlign w:val="center"/>
+            <w:hideMark/>
+          </w:tcPr>
+          <w:p>
+            <w:r>
+              <w:t>NULL</w:t>
+            </w:r>
+          </w:p>
+        </w:tc>
+      </w:tr>
+    </w:tbl>
+    <w:p/>
+    <w:p>
+      <w:pPr>
+        <w:rPr>
+          <w:b/>
+          <w:bCs/>
+        </w:rPr>
+      </w:pPr>
+      <w:r>
+        <w:rPr>
+          <w:b/>
+          <w:bCs/>
+        </w:rPr>
+        <w:t>3. RIGHT JOIN (RIGHT OUTER JOIN)</w:t>
+      </w:r>
+    </w:p>
+    <w:p>
+      <w:r>
+        <w:t xml:space="preserve">A </w:t>
+      </w:r>
+      <w:r>
+        <w:rPr>
+          <w:b/>
+          <w:bCs/>
+        </w:rPr>
+        <w:t>RIGHT JOIN</w:t>
+      </w:r>
+      <w:r>
+        <w:t xml:space="preserve"> returns all rows from the right table and matching rows from the left table.</w:t>
+      </w:r>
+    </w:p>
+    <w:tbl>
+      <w:tblPr>
+        <w:tblW w:w="0" w:type="auto"/>
+        <w:tblCellSpacing w:w="15" w:type="dxa"/>
+        <w:tblBorders>
+          <w:top w:val="single" w:sz="4" w:space="0" w:color="auto"/>
+          <w:left w:val="single" w:sz="4" w:space="0" w:color="auto"/>
+          <w:bottom w:val="single" w:sz="4" w:space="0" w:color="auto"/>
+          <w:right w:val="single" w:sz="4" w:space="0" w:color="auto"/>
+          <w:insideH w:val="single" w:sz="4" w:space="0" w:color="auto"/>
+          <w:insideV w:val="single" w:sz="4" w:space="0" w:color="auto"/>
+        </w:tblBorders>
+        <w:tblCellMar>
+          <w:top w:w="15" w:type="dxa"/>
+          <w:left w:w="15" w:type="dxa"/>
+          <w:bottom w:w="15" w:type="dxa"/>
+          <w:right w:w="15" w:type="dxa"/>
+        </w:tblCellMar>
+        <w:tblLook w:val="04A0" w:firstRow="1" w:lastRow="0" w:firstColumn="1" w:lastColumn="0" w:noHBand="0" w:noVBand="1"/>
+      </w:tblPr>
+      <w:tblGrid>
+        <w:gridCol w:w="1203"/>
+        <w:gridCol w:w="733"/>
+        <w:gridCol w:w="1416"/>
+      </w:tblGrid>
+      <w:tr>
+        <w:trPr>
+          <w:tblHeader/>
+          <w:tblCellSpacing w:w="15" w:type="dxa"/>
+        </w:trPr>
+        <w:tc>
+          <w:tcPr>
+            <w:tcW w:w="0" w:type="auto"/>
+            <w:vAlign w:val="center"/>
+            <w:hideMark/>
+          </w:tcPr>
+          <w:p>
+            <w:pPr>
+              <w:rPr>
+                <w:b/>
+                <w:bCs/>
+              </w:rPr>
+            </w:pPr>
+            <w:proofErr w:type="spellStart"/>
+            <w:r>
+              <w:rPr>
+                <w:b/>
+                <w:bCs/>
+              </w:rPr>
+              <w:t>StudentID</w:t>
+            </w:r>
+            <w:proofErr w:type="spellEnd"/>
+          </w:p>
+        </w:tc>
+        <w:tc>
+          <w:tcPr>
+            <w:tcW w:w="0" w:type="auto"/>
+            <w:vAlign w:val="center"/>
+            <w:hideMark/>
+          </w:tcPr>
+          <w:p>
+            <w:pPr>
+              <w:rPr>
+                <w:b/>
+                <w:bCs/>
+              </w:rPr>
+            </w:pPr>
+            <w:r>
+              <w:rPr>
+                <w:b/>
+                <w:bCs/>
+              </w:rPr>
+              <w:t>Name</w:t>
+            </w:r>
+          </w:p>
+        </w:tc>
+        <w:tc>
+          <w:tcPr>
+            <w:tcW w:w="0" w:type="auto"/>
+            <w:vAlign w:val="center"/>
+            <w:hideMark/>
+          </w:tcPr>
+          <w:p>
+            <w:pPr>
+              <w:rPr>
+                <w:b/>
+                <w:bCs/>
+              </w:rPr>
+            </w:pPr>
+            <w:r>
+              <w:rPr>
+                <w:b/>
+                <w:bCs/>
+              </w:rPr>
+              <w:t>Department</w:t>
+            </w:r>
+          </w:p>
+        </w:tc>
+      </w:tr>
+      <w:tr>
+        <w:trPr>
+          <w:tblCellSpacing w:w="15" w:type="dxa"/>
+        </w:trPr>
+        <w:tc>
+          <w:tcPr>
+            <w:tcW w:w="0" w:type="auto"/>
+            <w:vAlign w:val="center"/>
+            <w:hideMark/>
+          </w:tcPr>
+          <w:p>
+            <w:r>
+              <w:t>101</w:t>
+            </w:r>
+          </w:p>
+        </w:tc>
+        <w:tc>
+          <w:tcPr>
+            <w:tcW w:w="0" w:type="auto"/>
+            <w:vAlign w:val="center"/>
+            <w:hideMark/>
+          </w:tcPr>
+          <w:p>
+            <w:r>
+              <w:t>Alice</w:t>
+            </w:r>
+          </w:p>
+        </w:tc>
+        <w:tc>
+          <w:tcPr>
+            <w:tcW w:w="0" w:type="auto"/>
+            <w:vAlign w:val="center"/>
+            <w:hideMark/>
+          </w:tcPr>
+          <w:p>
+            <w:r>
+              <w:t>CSE</w:t>
+            </w:r>
+          </w:p>
+        </w:tc>
+      </w:tr>
+      <w:tr>
+        <w:trPr>
+          <w:tblCellSpacing w:w="15" w:type="dxa"/>
+        </w:trPr>
+        <w:tc>
+          <w:tcPr>
+            <w:tcW w:w="0" w:type="auto"/>
+            <w:vAlign w:val="center"/>
+            <w:hideMark/>
+          </w:tcPr>
+          <w:p>
+            <w:r>
+              <w:t>102</w:t>
+            </w:r>
+          </w:p>
+        </w:tc>
+        <w:tc>
+          <w:tcPr>
+            <w:tcW w:w="0" w:type="auto"/>
+            <w:vAlign w:val="center"/>
+            <w:hideMark/>
+          </w:tcPr>
+          <w:p>
+            <w:r>
+              <w:t>Bob</w:t>
+            </w:r>
+          </w:p>
+        </w:tc>
+        <w:tc>
+          <w:tcPr>
+            <w:tcW w:w="0" w:type="auto"/>
+            <w:vAlign w:val="center"/>
+            <w:hideMark/>
+          </w:tcPr>
+          <w:p>
+            <w:r>
+              <w:t>ECE</w:t>
+            </w:r>
+          </w:p>
+        </w:tc>
+      </w:tr>
+      <w:tr>
+        <w:trPr>
+          <w:tblCellSpacing w:w="15" w:type="dxa"/>
+        </w:trPr>
+        <w:tc>
+          <w:tcPr>
+            <w:tcW w:w="0" w:type="auto"/>
+            <w:vAlign w:val="center"/>
+            <w:hideMark/>
+          </w:tcPr>
+          <w:p>
+            <w:r>
+              <w:t>NULL</w:t>
+            </w:r>
+          </w:p>
+        </w:tc>
+        <w:tc>
+          <w:tcPr>
+            <w:tcW w:w="0" w:type="auto"/>
+            <w:vAlign w:val="center"/>
+            <w:hideMark/>
+          </w:tcPr>
+          <w:p>
+            <w:r>
+              <w:t>NULL</w:t>
+            </w:r>
+          </w:p>
+        </w:tc>
+        <w:tc>
+          <w:tcPr>
+            <w:tcW w:w="0" w:type="auto"/>
+            <w:vAlign w:val="center"/>
+            <w:hideMark/>
+          </w:tcPr>
+          <w:p>
+            <w:r>
+              <w:t>Civil</w:t>
+            </w:r>
+          </w:p>
+        </w:tc>
+      </w:tr>
+    </w:tbl>
+    <w:p/>
+    <w:p>
+      <w:pPr>
+        <w:rPr>
+          <w:b/>
+          <w:bCs/>
+        </w:rPr>
+      </w:pPr>
+      <w:r>
+        <w:rPr>
+          <w:b/>
+          <w:bCs/>
+        </w:rPr>
+        <w:t>4. FULL OUTER JOIN</w:t>
+      </w:r>
+    </w:p>
+    <w:p>
+      <w:r>
+        <w:t xml:space="preserve">A </w:t>
+      </w:r>
+      <w:r>
+        <w:rPr>
+          <w:b/>
+          <w:bCs/>
+        </w:rPr>
+        <w:t>FULL OUTER JOIN</w:t>
+      </w:r>
+      <w:r>
+        <w:t xml:space="preserve"> returns all records from both tables. Matching rows are combined, and non-matching rows contain NULL values.</w:t>
+      </w:r>
+    </w:p>
+    <w:p/>
+    <w:tbl>
+      <w:tblPr>
+        <w:tblW w:w="0" w:type="auto"/>
+        <w:tblCellSpacing w:w="15" w:type="dxa"/>
+        <w:tblBorders>
+          <w:top w:val="single" w:sz="4" w:space="0" w:color="auto"/>
+          <w:left w:val="single" w:sz="4" w:space="0" w:color="auto"/>
+          <w:bottom w:val="single" w:sz="4" w:space="0" w:color="auto"/>
+          <w:right w:val="single" w:sz="4" w:space="0" w:color="auto"/>
+          <w:insideH w:val="single" w:sz="4" w:space="0" w:color="auto"/>
+          <w:insideV w:val="single" w:sz="4" w:space="0" w:color="auto"/>
+        </w:tblBorders>
+        <w:tblCellMar>
+          <w:top w:w="15" w:type="dxa"/>
+          <w:left w:w="15" w:type="dxa"/>
+          <w:bottom w:w="15" w:type="dxa"/>
+          <w:right w:w="15" w:type="dxa"/>
+        </w:tblCellMar>
+        <w:tblLook w:val="04A0" w:firstRow="1" w:lastRow="0" w:firstColumn="1" w:lastColumn="0" w:noHBand="0" w:noVBand="1"/>
+      </w:tblPr>
+      <w:tblGrid>
+        <w:gridCol w:w="1203"/>
+        <w:gridCol w:w="833"/>
+        <w:gridCol w:w="1416"/>
+      </w:tblGrid>
+      <w:tr>
+        <w:trPr>
+          <w:tblHeader/>
+          <w:tblCellSpacing w:w="15" w:type="dxa"/>
+        </w:trPr>
+        <w:tc>
+          <w:tcPr>
+            <w:tcW w:w="0" w:type="auto"/>
+            <w:vAlign w:val="center"/>
+            <w:hideMark/>
+          </w:tcPr>
+          <w:p>
+            <w:pPr>
+              <w:rPr>
+                <w:b/>
+                <w:bCs/>
+              </w:rPr>
+            </w:pPr>
+            <w:proofErr w:type="spellStart"/>
+            <w:r>
+              <w:rPr>
+                <w:b/>
+                <w:bCs/>
+              </w:rPr>
+              <w:lastRenderedPageBreak/>
+              <w:t>StudentID</w:t>
+            </w:r>
+            <w:proofErr w:type="spellEnd"/>
+          </w:p>
+        </w:tc>
+        <w:tc>
+          <w:tcPr>
+            <w:tcW w:w="0" w:type="auto"/>
+            <w:vAlign w:val="center"/>
+            <w:hideMark/>
+          </w:tcPr>
+          <w:p>
+            <w:pPr>
+              <w:rPr>
+                <w:b/>
+                <w:bCs/>
+              </w:rPr>
+            </w:pPr>
+            <w:r>
+              <w:rPr>
+                <w:b/>
+                <w:bCs/>
+              </w:rPr>
+              <w:t>Name</w:t>
+            </w:r>
+          </w:p>
+        </w:tc>
+        <w:tc>
+          <w:tcPr>
+            <w:tcW w:w="0" w:type="auto"/>
+            <w:vAlign w:val="center"/>
+            <w:hideMark/>
+          </w:tcPr>
+          <w:p>
+            <w:pPr>
+              <w:rPr>
+                <w:b/>
+                <w:bCs/>
+              </w:rPr>
+            </w:pPr>
+            <w:r>
+              <w:rPr>
+                <w:b/>
+                <w:bCs/>
+              </w:rPr>
+              <w:t>Department</w:t>
+            </w:r>
+          </w:p>
+        </w:tc>
+      </w:tr>
+      <w:tr>
+        <w:trPr>
+          <w:tblCellSpacing w:w="15" w:type="dxa"/>
+        </w:trPr>
+        <w:tc>
+          <w:tcPr>
+            <w:tcW w:w="0" w:type="auto"/>
+            <w:vAlign w:val="center"/>
+            <w:hideMark/>
+          </w:tcPr>
+          <w:p>
+            <w:r>
+              <w:t>101</w:t>
+            </w:r>
+          </w:p>
+        </w:tc>
+        <w:tc>
+          <w:tcPr>
+            <w:tcW w:w="0" w:type="auto"/>
+            <w:vAlign w:val="center"/>
+            <w:hideMark/>
+          </w:tcPr>
+          <w:p>
+            <w:r>
+              <w:t>Alice</w:t>
+            </w:r>
+          </w:p>
+        </w:tc>
+        <w:tc>
+          <w:tcPr>
+            <w:tcW w:w="0" w:type="auto"/>
+            <w:vAlign w:val="center"/>
+            <w:hideMark/>
+          </w:tcPr>
+          <w:p>
+            <w:r>
+              <w:t>CSE</w:t>
+            </w:r>
+          </w:p>
+        </w:tc>
+      </w:tr>
+      <w:tr>
+        <w:trPr>
+          <w:tblCellSpacing w:w="15" w:type="dxa"/>
+        </w:trPr>
+        <w:tc>
+          <w:tcPr>
+            <w:tcW w:w="0" w:type="auto"/>
+            <w:vAlign w:val="center"/>
+            <w:hideMark/>
+          </w:tcPr>
+          <w:p>
+            <w:r>
+              <w:t>102</w:t>
+            </w:r>
+          </w:p>
+        </w:tc>
+        <w:tc>
+          <w:tcPr>
+            <w:tcW w:w="0" w:type="auto"/>
+            <w:vAlign w:val="center"/>
+            <w:hideMark/>
+          </w:tcPr>
+          <w:p>
+            <w:r>
+              <w:t>Bob</w:t>
+            </w:r>
+          </w:p>
+        </w:tc>
+        <w:tc>
+          <w:tcPr>
+            <w:tcW w:w="0" w:type="auto"/>
+            <w:vAlign w:val="center"/>
+            <w:hideMark/>
+          </w:tcPr>
+          <w:p>
+            <w:r>
+              <w:t>ECE</w:t>
+            </w:r>
+          </w:p>
+        </w:tc>
+      </w:tr>
+      <w:tr>
+        <w:trPr>
+          <w:tblCellSpacing w:w="15" w:type="dxa"/>
+        </w:trPr>
+        <w:tc>
+          <w:tcPr>
+            <w:tcW w:w="0" w:type="auto"/>
+            <w:vAlign w:val="center"/>
+            <w:hideMark/>
+          </w:tcPr>
+          <w:p>
+            <w:r>
+              <w:t>103</w:t>
+            </w:r>
+          </w:p>
+        </w:tc>
+        <w:tc>
+          <w:tcPr>
+            <w:tcW w:w="0" w:type="auto"/>
+            <w:vAlign w:val="center"/>
+            <w:hideMark/>
+          </w:tcPr>
+          <w:p>
+            <w:r>
+              <w:t>Charlie</w:t>
+            </w:r>
+          </w:p>
+        </w:tc>
+        <w:tc>
+          <w:tcPr>
+            <w:tcW w:w="0" w:type="auto"/>
+            <w:vAlign w:val="center"/>
+            <w:hideMark/>
+          </w:tcPr>
+          <w:p>
+            <w:r>
+              <w:t>NULL</w:t>
+            </w:r>
+          </w:p>
+        </w:tc>
+      </w:tr>
+      <w:tr>
+        <w:trPr>
+          <w:tblCellSpacing w:w="15" w:type="dxa"/>
+        </w:trPr>
+        <w:tc>
+          <w:tcPr>
+            <w:tcW w:w="0" w:type="auto"/>
+            <w:vAlign w:val="center"/>
+            <w:hideMark/>
+          </w:tcPr>
+          <w:p>
+            <w:r>
+              <w:t>104</w:t>
+            </w:r>
+          </w:p>
+        </w:tc>
+        <w:tc>
+          <w:tcPr>
+            <w:tcW w:w="0" w:type="auto"/>
+            <w:vAlign w:val="center"/>
+            <w:hideMark/>
+          </w:tcPr>
+          <w:p>
+            <w:r>
+              <w:t>David</w:t>
+            </w:r>
+          </w:p>
+        </w:tc>
+        <w:tc>
+          <w:tcPr>
+            <w:tcW w:w="0" w:type="auto"/>
+            <w:vAlign w:val="center"/>
+            <w:hideMark/>
+          </w:tcPr>
+          <w:p>
+            <w:r>
+              <w:t>NULL</w:t>
+            </w:r>
+          </w:p>
+        </w:tc>
+      </w:tr>
+      <w:tr>
+        <w:trPr>
+          <w:tblCellSpacing w:w="15" w:type="dxa"/>
+        </w:trPr>
+        <w:tc>
+          <w:tcPr>
+            <w:tcW w:w="0" w:type="auto"/>
+            <w:vAlign w:val="center"/>
+            <w:hideMark/>
+          </w:tcPr>
+          <w:p>
+            <w:r>
+              <w:t>NULL</w:t>
+            </w:r>
+          </w:p>
+        </w:tc>
+        <w:tc>
+          <w:tcPr>
+            <w:tcW w:w="0" w:type="auto"/>
+            <w:vAlign w:val="center"/>
+            <w:hideMark/>
+          </w:tcPr>
+          <w:p>
+            <w:r>
+              <w:t>NULL</w:t>
+            </w:r>
+          </w:p>
+        </w:tc>
+        <w:tc>
+          <w:tcPr>
+            <w:tcW w:w="0" w:type="auto"/>
+            <w:vAlign w:val="center"/>
+            <w:hideMark/>
+          </w:tcPr>
+          <w:p>
+            <w:r>
+              <w:t>Civil</w:t>
+            </w:r>
+          </w:p>
+        </w:tc>
+      </w:tr>
+    </w:tbl>
+    <w:p/>
+    <w:p>
+      <w:pPr>
+        <w:rPr>
+          <w:b/>
+          <w:bCs/>
+        </w:rPr>
+      </w:pPr>
+      <w:r>
+        <w:rPr>
+          <w:b/>
+          <w:bCs/>
+        </w:rPr>
+        <w:t>5. CROSS JOIN</w:t>
+      </w:r>
+    </w:p>
+    <w:p>
+      <w:r>
+        <w:t xml:space="preserve">A </w:t>
+      </w:r>
+      <w:r>
+        <w:rPr>
+          <w:b/>
+          <w:bCs/>
+        </w:rPr>
+        <w:t>CROSS JOIN</w:t>
+      </w:r>
+      <w:r>
+        <w:t xml:space="preserve"> returns the Cartesian product of two tables. Every row from the first table is combined with every row from the second table.</w:t>
+      </w:r>
+    </w:p>
+    <w:tbl>
+      <w:tblPr>
+        <w:tblW w:w="0" w:type="auto"/>
+        <w:tblCellSpacing w:w="15" w:type="dxa"/>
+        <w:tblBorders>
+          <w:top w:val="single" w:sz="4" w:space="0" w:color="auto"/>
+          <w:left w:val="single" w:sz="4" w:space="0" w:color="auto"/>
+          <w:bottom w:val="single" w:sz="4" w:space="0" w:color="auto"/>
+          <w:right w:val="single" w:sz="4" w:space="0" w:color="auto"/>
+          <w:insideH w:val="single" w:sz="4" w:space="0" w:color="auto"/>
+          <w:insideV w:val="single" w:sz="4" w:space="0" w:color="auto"/>
+        </w:tblBorders>
+        <w:tblCellMar>
+          <w:top w:w="15" w:type="dxa"/>
+          <w:left w:w="15" w:type="dxa"/>
+          <w:bottom w:w="15" w:type="dxa"/>
+          <w:right w:w="15" w:type="dxa"/>
+        </w:tblCellMar>
+        <w:tblLook w:val="04A0" w:firstRow="1" w:lastRow="0" w:firstColumn="1" w:lastColumn="0" w:noHBand="0" w:noVBand="1"/>
+      </w:tblPr>
+      <w:tblGrid>
+        <w:gridCol w:w="848"/>
+        <w:gridCol w:w="1416"/>
+      </w:tblGrid>
+      <w:tr>
+        <w:trPr>
+          <w:tblHeader/>
+          <w:tblCellSpacing w:w="15" w:type="dxa"/>
+        </w:trPr>
+        <w:tc>
+          <w:tcPr>
+            <w:tcW w:w="0" w:type="auto"/>
+            <w:vAlign w:val="center"/>
+            <w:hideMark/>
+          </w:tcPr>
+          <w:p>
+            <w:pPr>
+              <w:rPr>
+                <w:b/>
+                <w:bCs/>
+              </w:rPr>
+            </w:pPr>
+            <w:r>
+              <w:rPr>
+                <w:b/>
+                <w:bCs/>
+              </w:rPr>
+              <w:t>Name</w:t>
+            </w:r>
+          </w:p>
+        </w:tc>
+        <w:tc>
+          <w:tcPr>
+            <w:tcW w:w="0" w:type="auto"/>
+            <w:vAlign w:val="center"/>
+            <w:hideMark/>
+          </w:tcPr>
+          <w:p>
+            <w:pPr>
+              <w:rPr>
+                <w:b/>
+                <w:bCs/>
+              </w:rPr>
+            </w:pPr>
+            <w:r>
+              <w:rPr>
+                <w:b/>
+                <w:bCs/>
+              </w:rPr>
+              <w:t>Department</w:t>
+            </w:r>
+          </w:p>
+        </w:tc>
+      </w:tr>
+      <w:tr>
+        <w:trPr>
+          <w:tblCellSpacing w:w="15" w:type="dxa"/>
+        </w:trPr>
+        <w:tc>
+          <w:tcPr>
+            <w:tcW w:w="0" w:type="auto"/>
+            <w:vAlign w:val="center"/>
+            <w:hideMark/>
+          </w:tcPr>
+          <w:p>
+            <w:r>
+              <w:t>Alice</w:t>
+            </w:r>
+          </w:p>
+        </w:tc>
+        <w:tc>
+          <w:tcPr>
+            <w:tcW w:w="0" w:type="auto"/>
+            <w:vAlign w:val="center"/>
+            <w:hideMark/>
+          </w:tcPr>
+          <w:p>
+            <w:r>
+              <w:t>CSE</w:t>
+            </w:r>
+          </w:p>
+        </w:tc>
+      </w:tr>
+      <w:tr>
+        <w:trPr>
+          <w:tblCellSpacing w:w="15" w:type="dxa"/>
+        </w:trPr>
+        <w:tc>
+          <w:tcPr>
+            <w:tcW w:w="0" w:type="auto"/>
+            <w:vAlign w:val="center"/>
+            <w:hideMark/>
+          </w:tcPr>
+          <w:p>
+            <w:r>
+              <w:t>Alice</w:t>
+            </w:r>
+          </w:p>
+        </w:tc>
+        <w:tc>
+          <w:tcPr>
+            <w:tcW w:w="0" w:type="auto"/>
+            <w:vAlign w:val="center"/>
+            <w:hideMark/>
+          </w:tcPr>
+          <w:p>
+            <w:r>
+              <w:t>ECE</w:t>
+            </w:r>
+          </w:p>
+        </w:tc>
+      </w:tr>
+      <w:tr>
+        <w:trPr>
+          <w:tblCellSpacing w:w="15" w:type="dxa"/>
+        </w:trPr>
+        <w:tc>
+          <w:tcPr>
+            <w:tcW w:w="0" w:type="auto"/>
+            <w:vAlign w:val="center"/>
+            <w:hideMark/>
+          </w:tcPr>
+          <w:p>
+            <w:r>
+              <w:t>Alice</w:t>
+            </w:r>
+          </w:p>
+        </w:tc>
+        <w:tc>
+          <w:tcPr>
+            <w:tcW w:w="0" w:type="auto"/>
+            <w:vAlign w:val="center"/>
+            <w:hideMark/>
+          </w:tcPr>
+          <w:p>
+            <w:r>
+              <w:t>Civil</w:t>
+            </w:r>
+          </w:p>
+        </w:tc>
+      </w:tr>
+      <w:tr>
+        <w:trPr>
+          <w:tblCellSpacing w:w="15" w:type="dxa"/>
+        </w:trPr>
+        <w:tc>
+          <w:tcPr>
+            <w:tcW w:w="0" w:type="auto"/>
+            <w:vAlign w:val="center"/>
+            <w:hideMark/>
+          </w:tcPr>
+          <w:p>
+            <w:r>
+              <w:t>Bob</w:t>
+            </w:r>
+          </w:p>
+        </w:tc>
+        <w:tc>
+          <w:tcPr>
+            <w:tcW w:w="0" w:type="auto"/>
+            <w:vAlign w:val="center"/>
+            <w:hideMark/>
+          </w:tcPr>
+          <w:p>
+            <w:r>
+              <w:t>CSE</w:t>
+            </w:r>
+          </w:p>
+        </w:tc>
+      </w:tr>
+      <w:tr>
+        <w:trPr>
+          <w:tblCellSpacing w:w="15" w:type="dxa"/>
+        </w:trPr>
+        <w:tc>
+          <w:tcPr>
+            <w:tcW w:w="0" w:type="auto"/>
+            <w:vAlign w:val="center"/>
+            <w:hideMark/>
+          </w:tcPr>
+          <w:p>
+            <w:r>
+              <w:t>Bob</w:t>
+            </w:r>
+          </w:p>
+        </w:tc>
+        <w:tc>
+          <w:tcPr>
+            <w:tcW w:w="0" w:type="auto"/>
+            <w:vAlign w:val="center"/>
+            <w:hideMark/>
+          </w:tcPr>
+          <w:p>
+            <w:r>
+              <w:t>ECE</w:t>
+            </w:r>
+          </w:p>
+        </w:tc>
+      </w:tr>
+      <w:tr>
+        <w:trPr>
+          <w:tblCellSpacing w:w="15" w:type="dxa"/>
+        </w:trPr>
+        <w:tc>
+          <w:tcPr>
+            <w:tcW w:w="0" w:type="auto"/>
+            <w:vAlign w:val="center"/>
+            <w:hideMark/>
+          </w:tcPr>
+          <w:p>
+            <w:r>
+              <w:t>Bob</w:t>
+            </w:r>
+          </w:p>
+        </w:tc>
+        <w:tc>
+          <w:tcPr>
+            <w:tcW w:w="0" w:type="auto"/>
+            <w:vAlign w:val="center"/>
+            <w:hideMark/>
+          </w:tcPr>
+          <w:p>
+            <w:r>
+              <w:t>Civil</w:t>
+            </w:r>
+          </w:p>
+        </w:tc>
+      </w:tr>
+      <w:tr>
+        <w:trPr>
+          <w:tblCellSpacing w:w="15" w:type="dxa"/>
+        </w:trPr>
+        <w:tc>
+          <w:tcPr>
+            <w:tcW w:w="0" w:type="auto"/>
+            <w:vAlign w:val="center"/>
+            <w:hideMark/>
+          </w:tcPr>
+          <w:p>
+            <w:r>
+              <w:t>Charlie</w:t>
+            </w:r>
+          </w:p>
+        </w:tc>
+        <w:tc>
+          <w:tcPr>
+            <w:tcW w:w="0" w:type="auto"/>
+            <w:vAlign w:val="center"/>
+            <w:hideMark/>
+          </w:tcPr>
+          <w:p>
+            <w:r>
+              <w:t>CSE</w:t>
+            </w:r>
+          </w:p>
+        </w:tc>
+      </w:tr>
+      <w:tr>
+        <w:trPr>
+          <w:tblCellSpacing w:w="15" w:type="dxa"/>
+        </w:trPr>
+        <w:tc>
+          <w:tcPr>
+            <w:tcW w:w="0" w:type="auto"/>
+            <w:vAlign w:val="center"/>
+            <w:hideMark/>
+          </w:tcPr>
+          <w:p>
+            <w:r>
+              <w:t>Charlie</w:t>
+            </w:r>
+          </w:p>
+        </w:tc>
+        <w:tc>
+          <w:tcPr>
+            <w:tcW w:w="0" w:type="auto"/>
+            <w:vAlign w:val="center"/>
+            <w:hideMark/>
+          </w:tcPr>
+          <w:p>
+            <w:r>
+              <w:t>ECE</w:t>
+            </w:r>
+          </w:p>
+        </w:tc>
+      </w:tr>
+      <w:tr>
+        <w:trPr>
+          <w:tblCellSpacing w:w="15" w:type="dxa"/>
+        </w:trPr>
+        <w:tc>
+          <w:tcPr>
+            <w:tcW w:w="0" w:type="auto"/>
+            <w:vAlign w:val="center"/>
+            <w:hideMark/>
+          </w:tcPr>
+          <w:p>
+            <w:r>
+              <w:t>Charlie</w:t>
+            </w:r>
+          </w:p>
+        </w:tc>
+        <w:tc>
+          <w:tcPr>
+            <w:tcW w:w="0" w:type="auto"/>
+            <w:vAlign w:val="center"/>
+            <w:hideMark/>
+          </w:tcPr>
+          <w:p>
+            <w:r>
+              <w:t>Civil</w:t>
+            </w:r>
+          </w:p>
+        </w:tc>
+      </w:tr>
+      <w:tr>
+        <w:trPr>
+          <w:tblCellSpacing w:w="15" w:type="dxa"/>
+        </w:trPr>
+        <w:tc>
+          <w:tcPr>
+            <w:tcW w:w="0" w:type="auto"/>
+            <w:vAlign w:val="center"/>
+            <w:hideMark/>
+          </w:tcPr>
+          <w:p>
+            <w:r>
+              <w:t>David</w:t>
+            </w:r>
+          </w:p>
+        </w:tc>
+        <w:tc>
+          <w:tcPr>
+            <w:tcW w:w="0" w:type="auto"/>
+            <w:vAlign w:val="center"/>
+            <w:hideMark/>
+          </w:tcPr>
+          <w:p>
+            <w:r>
+              <w:t>CSE</w:t>
+            </w:r>
+          </w:p>
+        </w:tc>
+      </w:tr>
+      <w:tr>
+        <w:trPr>
+          <w:tblCellSpacing w:w="15" w:type="dxa"/>
+        </w:trPr>
+        <w:tc>
+          <w:tcPr>
+            <w:tcW w:w="0" w:type="auto"/>
+            <w:vAlign w:val="center"/>
+            <w:hideMark/>
+          </w:tcPr>
+          <w:p>
+            <w:r>
+              <w:t>David</w:t>
+            </w:r>
+          </w:p>
+        </w:tc>
+        <w:tc>
+          <w:tcPr>
+            <w:tcW w:w="0" w:type="auto"/>
+            <w:vAlign w:val="center"/>
+            <w:hideMark/>
+          </w:tcPr>
+          <w:p>
+            <w:r>
+              <w:t>ECE</w:t>
+            </w:r>
+          </w:p>
+        </w:tc>
+      </w:tr>
+      <w:tr>
+        <w:trPr>
+          <w:tblCellSpacing w:w="15" w:type="dxa"/>
+        </w:trPr>
+        <w:tc>
+          <w:tcPr>
+            <w:tcW w:w="0" w:type="auto"/>
+            <w:vAlign w:val="center"/>
+            <w:hideMark/>
+          </w:tcPr>
+          <w:p>
+            <w:r>
+              <w:t>David</w:t>
+            </w:r>
+          </w:p>
+        </w:tc>
+        <w:tc>
+          <w:tcPr>
+            <w:tcW w:w="0" w:type="auto"/>
+            <w:vAlign w:val="center"/>
+            <w:hideMark/>
+          </w:tcPr>
+          <w:p>
+            <w:r>
+              <w:t>Civil</w:t>
+            </w:r>
+          </w:p>
+        </w:tc>
+      </w:tr>
+    </w:tbl>
+    <w:p/>
+    <w:p/>
+    <w:p>
+      <w:pPr>
+        <w:rPr>
+          <w:b/>
+          <w:bCs/>
+        </w:rPr>
+      </w:pPr>
+      <w:r>
+        <w:rPr>
+          <w:b/>
+          <w:bCs/>
+        </w:rPr>
+        <w:lastRenderedPageBreak/>
+        <w:t>6. SELF JOIN</w:t>
+      </w:r>
+    </w:p>
+    <w:p>
+      <w:r>
+        <w:t xml:space="preserve">A </w:t>
+      </w:r>
+      <w:r>
+        <w:rPr>
+          <w:b/>
+          <w:bCs/>
+        </w:rPr>
+        <w:t>SELF JOIN</w:t>
+      </w:r>
+      <w:r>
+        <w:t xml:space="preserve"> joins a table with itself. It is commonly used to represent hierarchical relationships such as employees and managers.</w:t>
+      </w:r>
+    </w:p>
+    <w:tbl>
+      <w:tblPr>
+        <w:tblW w:w="0" w:type="auto"/>
+        <w:tblCellSpacing w:w="15" w:type="dxa"/>
+        <w:tblBorders>
+          <w:top w:val="single" w:sz="4" w:space="0" w:color="auto"/>
+          <w:left w:val="single" w:sz="4" w:space="0" w:color="auto"/>
+          <w:bottom w:val="single" w:sz="4" w:space="0" w:color="auto"/>
+          <w:right w:val="single" w:sz="4" w:space="0" w:color="auto"/>
+          <w:insideH w:val="single" w:sz="4" w:space="0" w:color="auto"/>
+          <w:insideV w:val="single" w:sz="4" w:space="0" w:color="auto"/>
+        </w:tblBorders>
+        <w:tblCellMar>
+          <w:top w:w="15" w:type="dxa"/>
+          <w:left w:w="15" w:type="dxa"/>
+          <w:bottom w:w="15" w:type="dxa"/>
+          <w:right w:w="15" w:type="dxa"/>
+        </w:tblCellMar>
+        <w:tblLook w:val="04A0" w:firstRow="1" w:lastRow="0" w:firstColumn="1" w:lastColumn="0" w:noHBand="0" w:noVBand="1"/>
+      </w:tblPr>
+      <w:tblGrid>
+        <w:gridCol w:w="827"/>
+        <w:gridCol w:w="1162"/>
+        <w:gridCol w:w="1278"/>
+      </w:tblGrid>
+      <w:tr>
+        <w:trPr>
+          <w:tblHeader/>
+          <w:tblCellSpacing w:w="15" w:type="dxa"/>
+        </w:trPr>
+        <w:tc>
+          <w:tcPr>
+            <w:tcW w:w="0" w:type="auto"/>
+            <w:vAlign w:val="center"/>
+            <w:hideMark/>
+          </w:tcPr>
+          <w:p>
+            <w:pPr>
+              <w:rPr>
+                <w:b/>
+                <w:bCs/>
+              </w:rPr>
+            </w:pPr>
+            <w:proofErr w:type="spellStart"/>
+            <w:r>
+              <w:rPr>
+                <w:b/>
+                <w:bCs/>
+              </w:rPr>
+              <w:t>EmpID</w:t>
+            </w:r>
+            <w:proofErr w:type="spellEnd"/>
+          </w:p>
+        </w:tc>
+        <w:tc>
+          <w:tcPr>
+            <w:tcW w:w="0" w:type="auto"/>
+            <w:vAlign w:val="center"/>
+            <w:hideMark/>
+          </w:tcPr>
+          <w:p>
+            <w:pPr>
+              <w:rPr>
+                <w:b/>
+                <w:bCs/>
+              </w:rPr>
+            </w:pPr>
+            <w:r>
+              <w:rPr>
+                <w:b/>
+                <w:bCs/>
+              </w:rPr>
+              <w:t>Employee</w:t>
+            </w:r>
+          </w:p>
+        </w:tc>
+        <w:tc>
+          <w:tcPr>
+            <w:tcW w:w="0" w:type="auto"/>
+            <w:vAlign w:val="center"/>
+            <w:hideMark/>
+          </w:tcPr>
+          <w:p>
+            <w:pPr>
+              <w:rPr>
+                <w:b/>
+                <w:bCs/>
+              </w:rPr>
+            </w:pPr>
+            <w:proofErr w:type="spellStart"/>
+            <w:r>
+              <w:rPr>
+                <w:b/>
+                <w:bCs/>
+              </w:rPr>
+              <w:t>ManagerID</w:t>
+            </w:r>
+            <w:proofErr w:type="spellEnd"/>
+          </w:p>
+        </w:tc>
+      </w:tr>
+      <w:tr>
+        <w:trPr>
+          <w:tblCellSpacing w:w="15" w:type="dxa"/>
+        </w:trPr>
+        <w:tc>
+          <w:tcPr>
+            <w:tcW w:w="0" w:type="auto"/>
+            <w:vAlign w:val="center"/>
+            <w:hideMark/>
+          </w:tcPr>
+          <w:p>
+            <w:r>
+              <w:t>1</w:t>
+            </w:r>
+          </w:p>
+        </w:tc>
+        <w:tc>
+          <w:tcPr>
+            <w:tcW w:w="0" w:type="auto"/>
+            <w:vAlign w:val="center"/>
+            <w:hideMark/>
+          </w:tcPr>
+          <w:p>
+            <w:r>
+              <w:t>Ravi</w:t>
+            </w:r>
+          </w:p>
+        </w:tc>
+        <w:tc>
+          <w:tcPr>
+            <w:tcW w:w="0" w:type="auto"/>
+            <w:vAlign w:val="center"/>
+            <w:hideMark/>
+          </w:tcPr>
+          <w:p>
+            <w:r>
+              <w:t>NULL</w:t>
+            </w:r>
+          </w:p>
+        </w:tc>
+      </w:tr>
+      <w:tr>
+        <w:trPr>
+          <w:tblCellSpacing w:w="15" w:type="dxa"/>
+        </w:trPr>
+        <w:tc>
+          <w:tcPr>
+            <w:tcW w:w="0" w:type="auto"/>
+            <w:vAlign w:val="center"/>
+            <w:hideMark/>
+          </w:tcPr>
+          <w:p>
+            <w:r>
+              <w:t>2</w:t>
+            </w:r>
+          </w:p>
+        </w:tc>
+        <w:tc>
+          <w:tcPr>
+            <w:tcW w:w="0" w:type="auto"/>
+            <w:vAlign w:val="center"/>
+            <w:hideMark/>
+          </w:tcPr>
+          <w:p>
+            <w:r>
+              <w:t>Amit</w:t>
+            </w:r>
+          </w:p>
+        </w:tc>
+        <w:tc>
+          <w:tcPr>
+            <w:tcW w:w="0" w:type="auto"/>
+            <w:vAlign w:val="center"/>
+            <w:hideMark/>
+          </w:tcPr>
+          <w:p>
+            <w:r>
+              <w:t>1</w:t>
+            </w:r>
+          </w:p>
+        </w:tc>
+      </w:tr>
+      <w:tr>
+        <w:trPr>
+          <w:tblCellSpacing w:w="15" w:type="dxa"/>
+        </w:trPr>
+        <w:tc>
+          <w:tcPr>
+            <w:tcW w:w="0" w:type="auto"/>
+            <w:vAlign w:val="center"/>
+            <w:hideMark/>
+          </w:tcPr>
+          <w:p>
+            <w:r>
+              <w:t>3</w:t>
+            </w:r>
+          </w:p>
+        </w:tc>
+        <w:tc>
+          <w:tcPr>
+            <w:tcW w:w="0" w:type="auto"/>
+            <w:vAlign w:val="center"/>
+            <w:hideMark/>
+          </w:tcPr>
+          <w:p>
+            <w:r>
+              <w:t>Priya</w:t>
+            </w:r>
+          </w:p>
+        </w:tc>
+        <w:tc>
+          <w:tcPr>
+            <w:tcW w:w="0" w:type="auto"/>
+            <w:vAlign w:val="center"/>
+            <w:hideMark/>
+          </w:tcPr>
+          <w:p>
+            <w:r>
+              <w:t>1</w:t>
+            </w:r>
+          </w:p>
+        </w:tc>
+      </w:tr>
+    </w:tbl>
+    <w:p/>
     <w:sectPr>
       <w:pgSz w:w="11906" w:h="16838"/>
       <w:pgMar w:top="1440" w:right="1440" w:bottom="1440" w:left="1440" w:header="708" w:footer="708" w:gutter="0"/>
@@ -6780,6 +9226,155 @@
     </w:lvl>
   </w:abstractNum>
   <w:abstractNum w:abstractNumId="13" w15:restartNumberingAfterBreak="0">
+    <w:nsid w:val="3B75474B"/>
+    <w:multiLevelType w:val="multilevel"/>
+    <w:tmpl w:val="943A0782"/>
+    <w:lvl w:ilvl="0">
+      <w:start w:val="1"/>
+      <w:numFmt w:val="bullet"/>
+      <w:lvlText w:val=""/>
+      <w:lvlJc w:val="left"/>
+      <w:pPr>
+        <w:tabs>
+          <w:tab w:val="num" w:pos="720"/>
+        </w:tabs>
+        <w:ind w:left="720" w:hanging="360"/>
+      </w:pPr>
+      <w:rPr>
+        <w:rFonts w:ascii="Symbol" w:hAnsi="Symbol" w:hint="default"/>
+        <w:sz w:val="20"/>
+      </w:rPr>
+    </w:lvl>
+    <w:lvl w:ilvl="1" w:tentative="1">
+      <w:start w:val="1"/>
+      <w:numFmt w:val="bullet"/>
+      <w:lvlText w:val="o"/>
+      <w:lvlJc w:val="left"/>
+      <w:pPr>
+        <w:tabs>
+          <w:tab w:val="num" w:pos="1440"/>
+        </w:tabs>
+        <w:ind w:left="1440" w:hanging="360"/>
+      </w:pPr>
+      <w:rPr>
+        <w:rFonts w:ascii="Courier New" w:hAnsi="Courier New" w:hint="default"/>
+        <w:sz w:val="20"/>
+      </w:rPr>
+    </w:lvl>
+    <w:lvl w:ilvl="2" w:tentative="1">
+      <w:start w:val="1"/>
+      <w:numFmt w:val="bullet"/>
+      <w:lvlText w:val=""/>
+      <w:lvlJc w:val="left"/>
+      <w:pPr>
+        <w:tabs>
+          <w:tab w:val="num" w:pos="2160"/>
+        </w:tabs>
+        <w:ind w:left="2160" w:hanging="360"/>
+      </w:pPr>
+      <w:rPr>
+        <w:rFonts w:ascii="Wingdings" w:hAnsi="Wingdings" w:hint="default"/>
+        <w:sz w:val="20"/>
+      </w:rPr>
+    </w:lvl>
+    <w:lvl w:ilvl="3" w:tentative="1">
+      <w:start w:val="1"/>
+      <w:numFmt w:val="bullet"/>
+      <w:lvlText w:val=""/>
+      <w:lvlJc w:val="left"/>
+      <w:pPr>
+        <w:tabs>
+          <w:tab w:val="num" w:pos="2880"/>
+        </w:tabs>
+        <w:ind w:left="2880" w:hanging="360"/>
+      </w:pPr>
+      <w:rPr>
+        <w:rFonts w:ascii="Wingdings" w:hAnsi="Wingdings" w:hint="default"/>
+        <w:sz w:val="20"/>
+      </w:rPr>
+    </w:lvl>
+    <w:lvl w:ilvl="4" w:tentative="1">
+      <w:start w:val="1"/>
+      <w:numFmt w:val="bullet"/>
+      <w:lvlText w:val=""/>
+      <w:lvlJc w:val="left"/>
+      <w:pPr>
+        <w:tabs>
+          <w:tab w:val="num" w:pos="3600"/>
+        </w:tabs>
+        <w:ind w:left="3600" w:hanging="360"/>
+      </w:pPr>
+      <w:rPr>
+        <w:rFonts w:ascii="Wingdings" w:hAnsi="Wingdings" w:hint="default"/>
+        <w:sz w:val="20"/>
+      </w:rPr>
+    </w:lvl>
+    <w:lvl w:ilvl="5" w:tentative="1">
+      <w:start w:val="1"/>
+      <w:numFmt w:val="bullet"/>
+      <w:lvlText w:val=""/>
+      <w:lvlJc w:val="left"/>
+      <w:pPr>
+        <w:tabs>
+          <w:tab w:val="num" w:pos="4320"/>
+        </w:tabs>
+        <w:ind w:left="4320" w:hanging="360"/>
+      </w:pPr>
+      <w:rPr>
+        <w:rFonts w:ascii="Wingdings" w:hAnsi="Wingdings" w:hint="default"/>
+        <w:sz w:val="20"/>
+      </w:rPr>
+    </w:lvl>
+    <w:lvl w:ilvl="6" w:tentative="1">
+      <w:start w:val="1"/>
+      <w:numFmt w:val="bullet"/>
+      <w:lvlText w:val=""/>
+      <w:lvlJc w:val="left"/>
+      <w:pPr>
+        <w:tabs>
+          <w:tab w:val="num" w:pos="5040"/>
+        </w:tabs>
+        <w:ind w:left="5040" w:hanging="360"/>
+      </w:pPr>
+      <w:rPr>
+        <w:rFonts w:ascii="Wingdings" w:hAnsi="Wingdings" w:hint="default"/>
+        <w:sz w:val="20"/>
+      </w:rPr>
+    </w:lvl>
+    <w:lvl w:ilvl="7" w:tentative="1">
+      <w:start w:val="1"/>
+      <w:numFmt w:val="bullet"/>
+      <w:lvlText w:val=""/>
+      <w:lvlJc w:val="left"/>
+      <w:pPr>
+        <w:tabs>
+          <w:tab w:val="num" w:pos="5760"/>
+        </w:tabs>
+        <w:ind w:left="5760" w:hanging="360"/>
+      </w:pPr>
+      <w:rPr>
+        <w:rFonts w:ascii="Wingdings" w:hAnsi="Wingdings" w:hint="default"/>
+        <w:sz w:val="20"/>
+      </w:rPr>
+    </w:lvl>
+    <w:lvl w:ilvl="8" w:tentative="1">
+      <w:start w:val="1"/>
+      <w:numFmt w:val="bullet"/>
+      <w:lvlText w:val=""/>
+      <w:lvlJc w:val="left"/>
+      <w:pPr>
+        <w:tabs>
+          <w:tab w:val="num" w:pos="6480"/>
+        </w:tabs>
+        <w:ind w:left="6480" w:hanging="360"/>
+      </w:pPr>
+      <w:rPr>
+        <w:rFonts w:ascii="Wingdings" w:hAnsi="Wingdings" w:hint="default"/>
+        <w:sz w:val="20"/>
+      </w:rPr>
+    </w:lvl>
+  </w:abstractNum>
+  <w:abstractNum w:abstractNumId="14" w15:restartNumberingAfterBreak="0">
     <w:nsid w:val="4620751C"/>
     <w:multiLevelType w:val="multilevel"/>
     <w:tmpl w:val="27C4D684"/>
@@ -6928,7 +9523,7 @@
       </w:rPr>
     </w:lvl>
   </w:abstractNum>
-  <w:abstractNum w:abstractNumId="14" w15:restartNumberingAfterBreak="0">
+  <w:abstractNum w:abstractNumId="15" w15:restartNumberingAfterBreak="0">
     <w:nsid w:val="511D02E8"/>
     <w:multiLevelType w:val="multilevel"/>
     <w:tmpl w:val="66821D70"/>
@@ -7077,7 +9672,7 @@
       </w:rPr>
     </w:lvl>
   </w:abstractNum>
-  <w:abstractNum w:abstractNumId="15" w15:restartNumberingAfterBreak="0">
+  <w:abstractNum w:abstractNumId="16" w15:restartNumberingAfterBreak="0">
     <w:nsid w:val="576C230D"/>
     <w:multiLevelType w:val="multilevel"/>
     <w:tmpl w:val="B002BA86"/>
@@ -7190,7 +9785,7 @@
       </w:pPr>
     </w:lvl>
   </w:abstractNum>
-  <w:abstractNum w:abstractNumId="16" w15:restartNumberingAfterBreak="0">
+  <w:abstractNum w:abstractNumId="17" w15:restartNumberingAfterBreak="0">
     <w:nsid w:val="67196696"/>
     <w:multiLevelType w:val="multilevel"/>
     <w:tmpl w:val="AA028EC0"/>
@@ -7339,7 +9934,7 @@
       </w:rPr>
     </w:lvl>
   </w:abstractNum>
-  <w:abstractNum w:abstractNumId="17" w15:restartNumberingAfterBreak="0">
+  <w:abstractNum w:abstractNumId="18" w15:restartNumberingAfterBreak="0">
     <w:nsid w:val="6D971AE5"/>
     <w:multiLevelType w:val="multilevel"/>
     <w:tmpl w:val="F6F0D922"/>
@@ -7488,7 +10083,7 @@
       </w:rPr>
     </w:lvl>
   </w:abstractNum>
-  <w:abstractNum w:abstractNumId="18" w15:restartNumberingAfterBreak="0">
+  <w:abstractNum w:abstractNumId="19" w15:restartNumberingAfterBreak="0">
     <w:nsid w:val="75406614"/>
     <w:multiLevelType w:val="multilevel"/>
     <w:tmpl w:val="B180F284"/>
@@ -7637,7 +10232,7 @@
       </w:rPr>
     </w:lvl>
   </w:abstractNum>
-  <w:abstractNum w:abstractNumId="19" w15:restartNumberingAfterBreak="0">
+  <w:abstractNum w:abstractNumId="20" w15:restartNumberingAfterBreak="0">
     <w:nsid w:val="75CF62FB"/>
     <w:multiLevelType w:val="multilevel"/>
     <w:tmpl w:val="13B09322"/>
@@ -7786,7 +10381,7 @@
       </w:rPr>
     </w:lvl>
   </w:abstractNum>
-  <w:abstractNum w:abstractNumId="20" w15:restartNumberingAfterBreak="0">
+  <w:abstractNum w:abstractNumId="21" w15:restartNumberingAfterBreak="0">
     <w:nsid w:val="75F75593"/>
     <w:multiLevelType w:val="multilevel"/>
     <w:tmpl w:val="43F8E1FE"/>
@@ -7899,7 +10494,7 @@
       </w:pPr>
     </w:lvl>
   </w:abstractNum>
-  <w:abstractNum w:abstractNumId="21" w15:restartNumberingAfterBreak="0">
+  <w:abstractNum w:abstractNumId="22" w15:restartNumberingAfterBreak="0">
     <w:nsid w:val="794F1082"/>
     <w:multiLevelType w:val="multilevel"/>
     <w:tmpl w:val="008AFFAA"/>
@@ -8067,13 +10662,13 @@
     <w:abstractNumId w:val="12"/>
   </w:num>
   <w:num w:numId="7" w16cid:durableId="466241667">
-    <w:abstractNumId w:val="18"/>
+    <w:abstractNumId w:val="19"/>
   </w:num>
   <w:num w:numId="8" w16cid:durableId="1881281184">
-    <w:abstractNumId w:val="16"/>
+    <w:abstractNumId w:val="17"/>
   </w:num>
   <w:num w:numId="9" w16cid:durableId="597180107">
-    <w:abstractNumId w:val="13"/>
+    <w:abstractNumId w:val="14"/>
   </w:num>
   <w:num w:numId="10" w16cid:durableId="573510921">
     <w:abstractNumId w:val="9"/>
@@ -8097,22 +10692,25 @@
     <w:abstractNumId w:val="0"/>
   </w:num>
   <w:num w:numId="17" w16cid:durableId="2066833821">
-    <w:abstractNumId w:val="19"/>
+    <w:abstractNumId w:val="20"/>
   </w:num>
   <w:num w:numId="18" w16cid:durableId="1326278297">
-    <w:abstractNumId w:val="14"/>
+    <w:abstractNumId w:val="15"/>
   </w:num>
   <w:num w:numId="19" w16cid:durableId="1642922394">
+    <w:abstractNumId w:val="22"/>
+  </w:num>
+  <w:num w:numId="20" w16cid:durableId="1239947720">
+    <w:abstractNumId w:val="18"/>
+  </w:num>
+  <w:num w:numId="21" w16cid:durableId="782531866">
+    <w:abstractNumId w:val="16"/>
+  </w:num>
+  <w:num w:numId="22" w16cid:durableId="1167786095">
     <w:abstractNumId w:val="21"/>
   </w:num>
-  <w:num w:numId="20" w16cid:durableId="1239947720">
-    <w:abstractNumId w:val="17"/>
-  </w:num>
-  <w:num w:numId="21" w16cid:durableId="782531866">
-    <w:abstractNumId w:val="15"/>
-  </w:num>
-  <w:num w:numId="22" w16cid:durableId="1167786095">
-    <w:abstractNumId w:val="20"/>
+  <w:num w:numId="23" w16cid:durableId="1114327983">
+    <w:abstractNumId w:val="13"/>
   </w:num>
 </w:numbering>
 </file>
@@ -8545,7 +11143,6 @@
     <w:next w:val="Normal"/>
     <w:link w:val="Heading2Char"/>
     <w:uiPriority w:val="9"/>
-    <w:semiHidden/>
     <w:unhideWhenUsed/>
     <w:qFormat/>
     <w:rsid w:val="0078033F"/>
@@ -8760,7 +11357,6 @@
     <w:basedOn w:val="DefaultParagraphFont"/>
     <w:link w:val="Heading2"/>
     <w:uiPriority w:val="9"/>
-    <w:semiHidden/>
     <w:rsid w:val="0078033F"/>
     <w:rPr>
       <w:rFonts w:asciiTheme="majorHAnsi" w:eastAsiaTheme="majorEastAsia" w:hAnsiTheme="majorHAnsi" w:cstheme="majorBidi"/>

</xml_diff>